<commit_message>
Resume: Lead Financial Compliance Analyst @ New Relic (MNC)
</commit_message>
<xml_diff>
--- a/resumes/Resume_Lead_Financial_Compliance_Analyst_New_Relic__MNC_.docx
+++ b/resumes/Resume_Lead_Financial_Compliance_Analyst_New_Relic__MNC_.docx
@@ -117,7 +117,7 @@
         <w:pBdr>
           <w:bottom w:val="single" w:sz="6" w:space="1" w:color="000000"/>
         </w:pBdr>
-        <w:spacing w:before="112" w:after="0"/>
+        <w:spacing w:before="141" w:after="0"/>
       </w:pPr>
       <w:r>
         <w:rPr>
@@ -289,7 +289,7 @@
     </w:p>
     <w:p>
       <w:pPr>
-        <w:spacing w:before="23" w:after="23"/>
+        <w:spacing w:before="30" w:after="30"/>
       </w:pPr>
     </w:p>
     <w:p>
@@ -297,7 +297,7 @@
         <w:pBdr>
           <w:bottom w:val="single" w:sz="6" w:space="1" w:color="000000"/>
         </w:pBdr>
-        <w:spacing w:before="112" w:after="0"/>
+        <w:spacing w:before="141" w:after="0"/>
       </w:pPr>
       <w:r>
         <w:rPr>
@@ -404,16 +404,16 @@
           <w:ilvl w:val="0"/>
           <w:numId w:val="2"/>
         </w:numPr>
-        <w:spacing w:before="13" w:after="32"/>
-      </w:pPr>
-      <w:r>
-        <w:rPr>
-          <w:rFonts w:ascii="Source Sans Pro" w:eastAsia="Source Sans Pro" w:hAnsi="Source Sans Pro" w:cs="Source Sans Pro"/>
-          <w:color w:val="000000"/>
-          <w:sz w:val="19"/>
-          <w:szCs w:val="19"/>
-        </w:rPr>
-        <w:t>Triaged 50+ weekly inventory reimbursement cases by severity and policy eligibility, prioritizing high-risk cases for timely resolution.</w:t>
+        <w:spacing w:before="13" w:after="38"/>
+      </w:pPr>
+      <w:r>
+        <w:rPr>
+          <w:rFonts w:ascii="Source Sans Pro" w:eastAsia="Source Sans Pro" w:hAnsi="Source Sans Pro" w:cs="Source Sans Pro"/>
+          <w:color w:val="000000"/>
+          <w:sz w:val="19"/>
+          <w:szCs w:val="19"/>
+        </w:rPr>
+        <w:t>Triaged 50+ weekly inventory reimbursement cases by severity and policy eligibility, identifying high-risk cases for early escalation.</w:t>
       </w:r>
     </w:p>
     <w:p>
@@ -423,16 +423,16 @@
           <w:ilvl w:val="0"/>
           <w:numId w:val="2"/>
         </w:numPr>
-        <w:spacing w:before="13" w:after="32"/>
-      </w:pPr>
-      <w:r>
-        <w:rPr>
-          <w:rFonts w:ascii="Source Sans Pro" w:eastAsia="Source Sans Pro" w:hAnsi="Source Sans Pro" w:cs="Source Sans Pro"/>
-          <w:color w:val="000000"/>
-          <w:sz w:val="19"/>
-          <w:szCs w:val="19"/>
-        </w:rPr>
-        <w:t>Investigated seller claims, identifying policy violations and anomalous patterns to prevent future occurrences.</w:t>
+        <w:spacing w:before="13" w:after="38"/>
+      </w:pPr>
+      <w:r>
+        <w:rPr>
+          <w:rFonts w:ascii="Source Sans Pro" w:eastAsia="Source Sans Pro" w:hAnsi="Source Sans Pro" w:cs="Source Sans Pro"/>
+          <w:color w:val="000000"/>
+          <w:sz w:val="19"/>
+          <w:szCs w:val="19"/>
+        </w:rPr>
+        <w:t>Investigated root cause analysis on seller claims, uncovering policy violations and anomalous patterns that informed compliance tracking.</w:t>
       </w:r>
     </w:p>
     <w:p>
@@ -442,16 +442,16 @@
           <w:ilvl w:val="0"/>
           <w:numId w:val="2"/>
         </w:numPr>
-        <w:spacing w:before="13" w:after="32"/>
-      </w:pPr>
-      <w:r>
-        <w:rPr>
-          <w:rFonts w:ascii="Source Sans Pro" w:eastAsia="Source Sans Pro" w:hAnsi="Source Sans Pro" w:cs="Source Sans Pro"/>
-          <w:color w:val="000000"/>
-          <w:sz w:val="19"/>
-          <w:szCs w:val="19"/>
-        </w:rPr>
-        <w:t>Maintained audit-ready case documentation with findings, decisions, evidence notes, and corrective actions aligned to evidence documentation and decision trails.</w:t>
+        <w:spacing w:before="13" w:after="38"/>
+      </w:pPr>
+      <w:r>
+        <w:rPr>
+          <w:rFonts w:ascii="Source Sans Pro" w:eastAsia="Source Sans Pro" w:hAnsi="Source Sans Pro" w:cs="Source Sans Pro"/>
+          <w:color w:val="000000"/>
+          <w:sz w:val="19"/>
+          <w:szCs w:val="19"/>
+        </w:rPr>
+        <w:t>Analyzed 200+ weekly cases to detect recurring fraud patterns, reducing repeat-issue investigation time through early flagging.</w:t>
       </w:r>
     </w:p>
     <w:p>
@@ -461,21 +461,21 @@
           <w:ilvl w:val="0"/>
           <w:numId w:val="2"/>
         </w:numPr>
-        <w:spacing w:before="13" w:after="32"/>
-      </w:pPr>
-      <w:r>
-        <w:rPr>
-          <w:rFonts w:ascii="Source Sans Pro" w:eastAsia="Source Sans Pro" w:hAnsi="Source Sans Pro" w:cs="Source Sans Pro"/>
-          <w:color w:val="000000"/>
-          <w:sz w:val="19"/>
-          <w:szCs w:val="19"/>
-        </w:rPr>
-        <w:t>Detected recurring fraud patterns across 200+ weekly cases, reducing repeat-issue investigation time through early flagging and corrective actions.</w:t>
-      </w:r>
-    </w:p>
-    <w:p>
-      <w:pPr>
-        <w:spacing w:before="23" w:after="23"/>
+        <w:spacing w:before="13" w:after="38"/>
+      </w:pPr>
+      <w:r>
+        <w:rPr>
+          <w:rFonts w:ascii="Source Sans Pro" w:eastAsia="Source Sans Pro" w:hAnsi="Source Sans Pro" w:cs="Source Sans Pro"/>
+          <w:color w:val="000000"/>
+          <w:sz w:val="19"/>
+          <w:szCs w:val="19"/>
+        </w:rPr>
+        <w:t>Documented audit-ready case findings, decisions, evidence notes, and corrective actions, ensuring compliance-ready case notes for senior reviewer review.</w:t>
+      </w:r>
+    </w:p>
+    <w:p>
+      <w:pPr>
+        <w:spacing w:before="30" w:after="30"/>
         <w:rPr>
           <w:rFonts w:ascii="Source Sans Pro" w:eastAsia="Source Sans Pro" w:hAnsi="Source Sans Pro" w:cs="Source Sans Pro"/>
           <w:b/>
@@ -488,7 +488,7 @@
     </w:p>
     <w:p>
       <w:pPr>
-        <w:spacing w:before="105" w:after="13"/>
+        <w:spacing w:before="134" w:after="13"/>
       </w:pPr>
       <w:r>
         <w:rPr>
@@ -519,7 +519,7 @@
             <w:szCs w:val="19"/>
             <w:u w:val="single"/>
           </w:rPr>
-          <w:t>Lead Financial Compliance Analyst at New Relic</w:t>
+          <w:t>Phishing and OSINT Threat Intelligence Tool</w:t>
         </w:r>
       </w:hyperlink>
       <w:r>
@@ -555,16 +555,16 @@
           <w:ilvl w:val="0"/>
           <w:numId w:val="2"/>
         </w:numPr>
-        <w:spacing w:before="13" w:after="32"/>
-      </w:pPr>
-      <w:r>
-        <w:rPr>
-          <w:rFonts w:ascii="Source Sans Pro" w:eastAsia="Source Sans Pro" w:hAnsi="Source Sans Pro" w:cs="Source Sans Pro"/>
-          <w:color w:val="000000"/>
-          <w:sz w:val="19"/>
-          <w:szCs w:val="19"/>
-        </w:rPr>
-        <w:t>Utilized audit-ready documentation to create evidence notes, control validation, and compliance tracking for financial transactions; documented decision trails and corrective actions for audit purposes.</w:t>
+        <w:spacing w:before="13" w:after="38"/>
+      </w:pPr>
+      <w:r>
+        <w:rPr>
+          <w:rFonts w:ascii="Source Sans Pro" w:eastAsia="Source Sans Pro" w:hAnsi="Source Sans Pro" w:cs="Source Sans Pro"/>
+          <w:color w:val="000000"/>
+          <w:sz w:val="19"/>
+          <w:szCs w:val="19"/>
+        </w:rPr>
+        <w:t>Built multi-API threat intelligence pipeline using P1_TECH tools: submits suspicious data to VirusTotal, AbuseIPDB, and URLScan.io, cross-referencing WHOIS, DNS, and SSL details.</w:t>
       </w:r>
     </w:p>
     <w:p>
@@ -574,16 +574,16 @@
           <w:ilvl w:val="0"/>
           <w:numId w:val="2"/>
         </w:numPr>
-        <w:spacing w:before="13" w:after="32"/>
-      </w:pPr>
-      <w:r>
-        <w:rPr>
-          <w:rFonts w:ascii="Source Sans Pro" w:eastAsia="Source Sans Pro" w:hAnsi="Source Sans Pro" w:cs="Source Sans Pro"/>
-          <w:color w:val="000000"/>
-          <w:sz w:val="19"/>
-          <w:szCs w:val="19"/>
-        </w:rPr>
-        <w:t>Developed anomaly detection at scale by implementing pattern recognition and repeat-issue flagging for financial compliance; escalated early warnings to relevant stakeholders.</w:t>
+        <w:spacing w:before="13" w:after="38"/>
+      </w:pPr>
+      <w:r>
+        <w:rPr>
+          <w:rFonts w:ascii="Source Sans Pro" w:eastAsia="Source Sans Pro" w:hAnsi="Source Sans Pro" w:cs="Source Sans Pro"/>
+          <w:color w:val="000000"/>
+          <w:sz w:val="19"/>
+          <w:szCs w:val="19"/>
+        </w:rPr>
+        <w:t>Implemented typosquatting domain detector generating brand domain variants and checking live DNS resolution for brand-impersonation analysis using P1_TECH tools and project details.</w:t>
       </w:r>
     </w:p>
     <w:p>
@@ -593,21 +593,21 @@
           <w:ilvl w:val="0"/>
           <w:numId w:val="2"/>
         </w:numPr>
-        <w:spacing w:before="13" w:after="32"/>
-      </w:pPr>
-      <w:r>
-        <w:rPr>
-          <w:rFonts w:ascii="Source Sans Pro" w:eastAsia="Source Sans Pro" w:hAnsi="Source Sans Pro" w:cs="Source Sans Pro"/>
-          <w:color w:val="000000"/>
-          <w:sz w:val="19"/>
-          <w:szCs w:val="19"/>
-        </w:rPr>
-        <w:t>Maintained audit-ready case notes, control evidence, and decision trails for financial compliance; ensured compliance tracking and documentation completeness.</w:t>
-      </w:r>
-    </w:p>
-    <w:p>
-      <w:pPr>
-        <w:spacing w:before="23" w:after="23"/>
+        <w:spacing w:before="13" w:after="38"/>
+      </w:pPr>
+      <w:r>
+        <w:rPr>
+          <w:rFonts w:ascii="Source Sans Pro" w:eastAsia="Source Sans Pro" w:hAnsi="Source Sans Pro" w:cs="Source Sans Pro"/>
+          <w:color w:val="000000"/>
+          <w:sz w:val="19"/>
+          <w:szCs w:val="19"/>
+        </w:rPr>
+        <w:t>Deployed Telegram bot interface for IOC enrichment, supporting bulk CSV input/output and OSINT enrichment via theHarvester for domain profiling.</w:t>
+      </w:r>
+    </w:p>
+    <w:p>
+      <w:pPr>
+        <w:spacing w:before="30" w:after="30"/>
       </w:pPr>
     </w:p>
     <w:p>
@@ -627,7 +627,7 @@
             <w:szCs w:val="19"/>
             <w:u w:val="single"/>
           </w:rPr>
-          <w:t>Inventory Reimbursement Case Triage at Amazon</w:t>
+          <w:t>Vulnerability Scanner and Patch Prioritization Engine</w:t>
         </w:r>
       </w:hyperlink>
       <w:r>
@@ -663,16 +663,16 @@
           <w:ilvl w:val="0"/>
           <w:numId w:val="2"/>
         </w:numPr>
-        <w:spacing w:before="13" w:after="32"/>
-      </w:pPr>
-      <w:r>
-        <w:rPr>
-          <w:rFonts w:ascii="Source Sans Pro" w:eastAsia="Source Sans Pro" w:hAnsi="Source Sans Pro" w:cs="Source Sans Pro"/>
-          <w:color w:val="000000"/>
-          <w:sz w:val="19"/>
-          <w:szCs w:val="19"/>
-        </w:rPr>
-        <w:t>Built automated vulnerability assessment pipeline integrating Nessus and OpenVAS REST APIs in Python; generated CVE reports classified by CVSS severity (vulnerability prioritisation) and EPSS context from the FIRST.org API.</w:t>
+        <w:spacing w:before="13" w:after="38"/>
+      </w:pPr>
+      <w:r>
+        <w:rPr>
+          <w:rFonts w:ascii="Source Sans Pro" w:eastAsia="Source Sans Pro" w:hAnsi="Source Sans Pro" w:cs="Source Sans Pro"/>
+          <w:color w:val="000000"/>
+          <w:sz w:val="19"/>
+          <w:szCs w:val="19"/>
+        </w:rPr>
+        <w:t>Built automated vulnerability assessment pipeline integrating Nessus and OpenVAS REST APIs in Python, generating CVE reports with CVSS severity and EPSS context from FIRST.org API.</w:t>
       </w:r>
     </w:p>
     <w:p>
@@ -682,16 +682,16 @@
           <w:ilvl w:val="0"/>
           <w:numId w:val="2"/>
         </w:numPr>
-        <w:spacing w:before="13" w:after="32"/>
-      </w:pPr>
-      <w:r>
-        <w:rPr>
-          <w:rFonts w:ascii="Source Sans Pro" w:eastAsia="Source Sans Pro" w:hAnsi="Source Sans Pro" w:cs="Source Sans Pro"/>
-          <w:color w:val="000000"/>
-          <w:sz w:val="19"/>
-          <w:szCs w:val="19"/>
-        </w:rPr>
-        <w:t>Developed OWASP Top 10 (web application security) automated web checker that sends crafted HTTP requests to detect injection, broken auth, and SSRF vulnerabilities; documented SQL injection exploit and parameterised query remediation.</w:t>
+        <w:spacing w:before="13" w:after="38"/>
+      </w:pPr>
+      <w:r>
+        <w:rPr>
+          <w:rFonts w:ascii="Source Sans Pro" w:eastAsia="Source Sans Pro" w:hAnsi="Source Sans Pro" w:cs="Source Sans Pro"/>
+          <w:color w:val="000000"/>
+          <w:sz w:val="19"/>
+          <w:szCs w:val="19"/>
+        </w:rPr>
+        <w:t>Developed OWASP Top 10 automated web checker using P2_TECH tools and details, detecting injection, broken auth, and SSRF vulnerabilities, documenting SQL injection remediation.</w:t>
       </w:r>
     </w:p>
     <w:p>
@@ -701,22 +701,22 @@
           <w:ilvl w:val="0"/>
           <w:numId w:val="2"/>
         </w:numPr>
-        <w:spacing w:before="13" w:after="32"/>
-      </w:pPr>
-      <w:r>
-        <w:rPr>
-          <w:rFonts w:ascii="Source Sans Pro" w:eastAsia="Source Sans Pro" w:hAnsi="Source Sans Pro" w:cs="Source Sans Pro"/>
-          <w:color w:val="000000"/>
-          <w:sz w:val="19"/>
-          <w:szCs w:val="19"/>
-        </w:rPr>
-        <w:t>Automated scan scheduling via Bash and cron; built delta-scan logic to flag newly discovered CVEs and organize patch compliance (remediation tracking) tracking evidence.</w:t>
+        <w:spacing w:before="13" w:after="38"/>
+      </w:pPr>
+      <w:r>
+        <w:rPr>
+          <w:rFonts w:ascii="Source Sans Pro" w:eastAsia="Source Sans Pro" w:hAnsi="Source Sans Pro" w:cs="Source Sans Pro"/>
+          <w:color w:val="000000"/>
+          <w:sz w:val="19"/>
+          <w:szCs w:val="19"/>
+        </w:rPr>
+        <w:t>Automated scan scheduling via Bash and cron, built delta-scan logic to flag CVEs and track patch compliance.</w:t>
       </w:r>
     </w:p>
     <w:p>
       <w:pPr>
         <w:pStyle w:val="ListParagraph"/>
-        <w:spacing w:before="23" w:after="23"/>
+        <w:spacing w:before="30" w:after="30"/>
         <w:ind w:left="450"/>
       </w:pPr>
     </w:p>
@@ -725,7 +725,7 @@
         <w:pBdr>
           <w:bottom w:val="single" w:sz="6" w:space="1" w:color="000000"/>
         </w:pBdr>
-        <w:spacing w:before="112" w:after="0"/>
+        <w:spacing w:before="141" w:after="0"/>
       </w:pPr>
       <w:r>
         <w:rPr>
@@ -741,7 +741,7 @@
     </w:p>
     <w:p>
       <w:pPr>
-        <w:spacing w:before="47" w:after="47"/>
+        <w:spacing w:before="54" w:after="54"/>
       </w:pPr>
       <w:r>
         <w:rPr>
@@ -763,7 +763,7 @@
     </w:p>
     <w:p>
       <w:pPr>
-        <w:spacing w:before="47" w:after="47"/>
+        <w:spacing w:before="54" w:after="54"/>
       </w:pPr>
       <w:r>
         <w:rPr>
@@ -785,7 +785,7 @@
     </w:p>
     <w:p>
       <w:pPr>
-        <w:spacing w:before="47" w:after="47"/>
+        <w:spacing w:before="54" w:after="54"/>
       </w:pPr>
       <w:r>
         <w:rPr>
@@ -807,7 +807,7 @@
     </w:p>
     <w:p>
       <w:pPr>
-        <w:spacing w:before="47" w:after="47"/>
+        <w:spacing w:before="54" w:after="54"/>
       </w:pPr>
       <w:r>
         <w:rPr>
@@ -829,7 +829,7 @@
     </w:p>
     <w:p>
       <w:pPr>
-        <w:spacing w:before="47" w:after="47"/>
+        <w:spacing w:before="54" w:after="54"/>
       </w:pPr>
       <w:r>
         <w:rPr>
@@ -854,7 +854,7 @@
         <w:pBdr>
           <w:bottom w:val="single" w:sz="6" w:space="1" w:color="000000"/>
         </w:pBdr>
-        <w:spacing w:before="23" w:after="23"/>
+        <w:spacing w:before="30" w:after="30"/>
         <w:rPr>
           <w:rFonts w:ascii="Source Sans Pro" w:eastAsia="Source Sans Pro" w:hAnsi="Source Sans Pro" w:cs="Source Sans Pro"/>
           <w:b/>
@@ -870,7 +870,7 @@
         <w:pBdr>
           <w:bottom w:val="single" w:sz="6" w:space="1" w:color="000000"/>
         </w:pBdr>
-        <w:spacing w:before="112" w:after="0"/>
+        <w:spacing w:before="141" w:after="0"/>
       </w:pPr>
       <w:r>
         <w:rPr>
@@ -891,7 +891,7 @@
           <w:ilvl w:val="0"/>
           <w:numId w:val="2"/>
         </w:numPr>
-        <w:spacing w:before="13" w:after="32"/>
+        <w:spacing w:before="13" w:after="38"/>
       </w:pPr>
       <w:r>
         <w:rPr>
@@ -910,7 +910,7 @@
           <w:ilvl w:val="0"/>
           <w:numId w:val="2"/>
         </w:numPr>
-        <w:spacing w:before="13" w:after="32"/>
+        <w:spacing w:before="13" w:after="38"/>
       </w:pPr>
       <w:r>
         <w:rPr>

</xml_diff>